<commit_message>
feat: add repair pipeline, warranty/metodo aliado fields, configurable import tax, and delivery lifecycle
- Add garantía, método aliado, and daño fields to UnidadProducto
- Add repair pipeline endpoints (reportar-dano, iniciar/completar reparación, devolver)
- Make porcentaje_impuesto configurable in OrdenCompra (no longer hardcoded 2%)
- Add VentaUpdateSerializer with delivery state cascade to units
- Restore unit to sin_vender on separation cancellation
- Translate model choices to Spanish
- Remove Invoice ITEM_CHOICES, make item field free text
- Update invoice template
</commit_message>
<xml_diff>
--- a/sales/templates/plantilla_factura.docx
+++ b/sales/templates/plantilla_factura.docx
@@ -78,16 +78,6 @@
           </w:tcPr>
           <w:p>
             <w:r>
-              <w:t>Producto</w:t>
-            </w:r>
-          </w:p>
-        </w:tc>
-        <w:tc>
-          <w:tcPr>
-            <w:tcW w:w="2188" w:type="dxa"/>
-          </w:tcPr>
-          <w:p>
-            <w:r>
               <w:rPr>
                 <w:b/>
                 <w:bCs/>
@@ -119,16 +109,6 @@
           <w:p>
             <w:r>
               <w:t>{{concepto}}</w:t>
-            </w:r>
-          </w:p>
-        </w:tc>
-        <w:tc>
-          <w:tcPr>
-            <w:tcW w:w="2188" w:type="dxa"/>
-          </w:tcPr>
-          <w:p>
-            <w:r>
-              <w:t>{{item}}</w:t>
             </w:r>
           </w:p>
         </w:tc>

</xml_diff>